<commit_message>
v2 - Engraved pgs 1-5
</commit_message>
<xml_diff>
--- a/Manuscript and House Style/Manuscript/Bonecas Russas Edits.docx
+++ b/Manuscript and House Style/Manuscript/Bonecas Russas Edits.docx
@@ -4,44 +4,60 @@
   <w:body>
     <w:p>
       <w:pPr>
+        <w:ind w:firstLine="360"/>
         <w:rPr>
           <w:b/>
           <w:bCs/>
-          <w:color w:val="0000FF"/>
-        </w:rPr>
-      </w:pPr>
+        </w:rPr>
+      </w:pPr>
+      <w:proofErr w:type="spellStart"/>
       <w:r>
         <w:rPr>
           <w:b/>
           <w:bCs/>
-          <w:color w:val="0000FF"/>
-        </w:rPr>
-        <w:t xml:space="preserve">Bonecas Russas </w:t>
-      </w:r>
+        </w:rPr>
+        <w:t>Bonecas</w:t>
+      </w:r>
+      <w:proofErr w:type="spellEnd"/>
       <w:r>
         <w:rPr>
           <w:b/>
           <w:bCs/>
-          <w:color w:val="0000FF"/>
-        </w:rPr>
-        <w:t xml:space="preserve">Part 1 </w:t>
-      </w:r>
+        </w:rPr>
+        <w:t xml:space="preserve"> </w:t>
+      </w:r>
+      <w:proofErr w:type="spellStart"/>
       <w:r>
         <w:rPr>
           <w:b/>
           <w:bCs/>
-          <w:color w:val="0000FF"/>
+        </w:rPr>
+        <w:t>Russas</w:t>
+      </w:r>
+      <w:proofErr w:type="spellEnd"/>
+      <w:r>
+        <w:rPr>
+          <w:b/>
+          <w:bCs/>
+        </w:rPr>
+        <w:t xml:space="preserve"> </w:t>
+      </w:r>
+      <w:r>
+        <w:rPr>
+          <w:b/>
+          <w:bCs/>
+        </w:rPr>
+        <w:t xml:space="preserve">Part 1 </w:t>
+      </w:r>
+      <w:r>
+        <w:rPr>
+          <w:b/>
+          <w:bCs/>
         </w:rPr>
         <w:t>Edits</w:t>
       </w:r>
     </w:p>
-    <w:p>
-      <w:pPr>
-        <w:rPr>
-          <w:color w:val="0000FF"/>
-        </w:rPr>
-      </w:pPr>
-    </w:p>
+    <w:p/>
     <w:p>
       <w:pPr>
         <w:pStyle w:val="ListParagraph"/>
@@ -50,26 +66,40 @@
           <w:numId w:val="2"/>
         </w:numPr>
         <w:rPr>
-          <w:color w:val="0000FF"/>
-        </w:rPr>
-      </w:pPr>
-      <w:r>
-        <w:rPr>
-          <w:color w:val="0000FF"/>
-        </w:rPr>
-        <w:t xml:space="preserve">M6 -9, Bcl: see edits to manuscript and update current version. They are 1) I added tons of dynamics; M9 I added triplet rest before fermata  and beat 1 </w:t>
+          <w:color w:val="A6A6A6" w:themeColor="background1" w:themeShade="A6"/>
+        </w:rPr>
+      </w:pPr>
+      <w:r>
+        <w:rPr>
+          <w:color w:val="A6A6A6" w:themeColor="background1" w:themeShade="A6"/>
+        </w:rPr>
+        <w:t xml:space="preserve">M6 -9, </w:t>
+      </w:r>
+      <w:proofErr w:type="spellStart"/>
+      <w:r>
+        <w:rPr>
+          <w:color w:val="A6A6A6" w:themeColor="background1" w:themeShade="A6"/>
+        </w:rPr>
+        <w:t>Bcl</w:t>
+      </w:r>
+      <w:proofErr w:type="spellEnd"/>
+      <w:r>
+        <w:rPr>
+          <w:color w:val="A6A6A6" w:themeColor="background1" w:themeShade="A6"/>
+        </w:rPr>
+        <w:t xml:space="preserve">: see edits to manuscript and update current version. They are 1) I added tons of dynamics; M9 I added triplet rest before fermata  and beat 1 </w:t>
       </w:r>
       <w:proofErr w:type="gramStart"/>
       <w:r>
         <w:rPr>
-          <w:color w:val="0000FF"/>
+          <w:color w:val="A6A6A6" w:themeColor="background1" w:themeShade="A6"/>
         </w:rPr>
         <w:t>dynamics</w:t>
       </w:r>
       <w:proofErr w:type="gramEnd"/>
       <w:r>
         <w:rPr>
-          <w:color w:val="0000FF"/>
+          <w:color w:val="A6A6A6" w:themeColor="background1" w:themeShade="A6"/>
         </w:rPr>
         <w:t>.</w:t>
       </w:r>
@@ -138,14 +168,14 @@
     <w:p>
       <w:pPr>
         <w:rPr>
-          <w:color w:val="0000FF"/>
-        </w:rPr>
-      </w:pPr>
-    </w:p>
-    <w:p>
-      <w:pPr>
-        <w:rPr>
-          <w:color w:val="0000FF"/>
+          <w:color w:val="A6A6A6" w:themeColor="background1" w:themeShade="A6"/>
+        </w:rPr>
+      </w:pPr>
+    </w:p>
+    <w:p>
+      <w:pPr>
+        <w:rPr>
+          <w:color w:val="A6A6A6" w:themeColor="background1" w:themeShade="A6"/>
         </w:rPr>
       </w:pPr>
     </w:p>
@@ -157,12 +187,12 @@
           <w:numId w:val="2"/>
         </w:numPr>
         <w:rPr>
-          <w:color w:val="0000FF"/>
-        </w:rPr>
-      </w:pPr>
-      <w:r>
-        <w:rPr>
-          <w:color w:val="0000FF"/>
+          <w:color w:val="A6A6A6" w:themeColor="background1" w:themeShade="A6"/>
+        </w:rPr>
+      </w:pPr>
+      <w:r>
+        <w:rPr>
+          <w:color w:val="A6A6A6" w:themeColor="background1" w:themeShade="A6"/>
         </w:rPr>
         <w:t xml:space="preserve">M11, add “ </w:t>
       </w:r>
@@ -170,7 +200,7 @@
         <w:rPr>
           <w:b/>
           <w:bCs/>
-          <w:color w:val="0000FF"/>
+          <w:color w:val="A6A6A6" w:themeColor="background1" w:themeShade="A6"/>
           <w:sz w:val="28"/>
           <w:szCs w:val="28"/>
         </w:rPr>
@@ -178,13 +208,13 @@
       </w:r>
       <w:r>
         <w:rPr>
-          <w:color w:val="0000FF"/>
+          <w:color w:val="A6A6A6" w:themeColor="background1" w:themeShade="A6"/>
         </w:rPr>
         <w:t>” next to fermata in the end of the bar (score and parts)</w:t>
       </w:r>
       <w:r>
         <w:rPr>
-          <w:color w:val="0000FF"/>
+          <w:color w:val="A6A6A6" w:themeColor="background1" w:themeShade="A6"/>
         </w:rPr>
         <w:br/>
       </w:r>
@@ -197,18 +227,18 @@
           <w:numId w:val="2"/>
         </w:numPr>
         <w:rPr>
-          <w:color w:val="0000FF"/>
-        </w:rPr>
-      </w:pPr>
-      <w:r>
-        <w:rPr>
-          <w:color w:val="0000FF"/>
+          <w:color w:val="A6A6A6" w:themeColor="background1" w:themeShade="A6"/>
+        </w:rPr>
+      </w:pPr>
+      <w:r>
+        <w:rPr>
+          <w:color w:val="A6A6A6" w:themeColor="background1" w:themeShade="A6"/>
         </w:rPr>
         <w:t>M12, change tempo to quarter = 52</w:t>
       </w:r>
       <w:r>
         <w:rPr>
-          <w:color w:val="0000FF"/>
+          <w:color w:val="A6A6A6" w:themeColor="background1" w:themeShade="A6"/>
         </w:rPr>
         <w:br/>
       </w:r>
@@ -226,22 +256,36 @@
       </w:pPr>
       <w:r>
         <w:rPr>
-          <w:color w:val="0000FF"/>
+          <w:color w:val="A6A6A6" w:themeColor="background1" w:themeShade="A6"/>
         </w:rPr>
         <w:t>M15, voice: beat 1 add diminuendo between 1</w:t>
       </w:r>
       <w:r>
         <w:rPr>
-          <w:color w:val="0000FF"/>
+          <w:color w:val="A6A6A6" w:themeColor="background1" w:themeShade="A6"/>
           <w:vertAlign w:val="superscript"/>
         </w:rPr>
         <w:t>st</w:t>
       </w:r>
       <w:r>
         <w:rPr>
-          <w:color w:val="0000FF"/>
-        </w:rPr>
-        <w:t xml:space="preserve"> and second notes, to pp; then back to mp on beat 4</w:t>
+          <w:color w:val="A6A6A6" w:themeColor="background1" w:themeShade="A6"/>
+        </w:rPr>
+        <w:t xml:space="preserve"> and second notes, to pp; then back to </w:t>
+      </w:r>
+      <w:proofErr w:type="spellStart"/>
+      <w:r>
+        <w:rPr>
+          <w:color w:val="A6A6A6" w:themeColor="background1" w:themeShade="A6"/>
+        </w:rPr>
+        <w:t>mp</w:t>
+      </w:r>
+      <w:proofErr w:type="spellEnd"/>
+      <w:r>
+        <w:rPr>
+          <w:color w:val="A6A6A6" w:themeColor="background1" w:themeShade="A6"/>
+        </w:rPr>
+        <w:t xml:space="preserve"> on beat 4</w:t>
       </w:r>
       <w:r>
         <w:rPr>
@@ -265,7 +309,14 @@
         <w:rPr>
           <w:color w:val="0000FF"/>
         </w:rPr>
-        <w:t xml:space="preserve">M17, voice: add diminuendo to </w:t>
+        <w:t xml:space="preserve">M17, voice: add diminuendo </w:t>
+      </w:r>
+      <w:proofErr w:type="spellStart"/>
+      <w:r>
+        <w:rPr>
+          <w:color w:val="0000FF"/>
+        </w:rPr>
+        <w:t xml:space="preserve">to </w:t>
       </w:r>
       <w:r>
         <w:rPr>
@@ -273,6 +324,7 @@
         </w:rPr>
         <w:t>p</w:t>
       </w:r>
+      <w:proofErr w:type="spellEnd"/>
       <w:r>
         <w:rPr>
           <w:color w:val="0000FF"/>
@@ -296,7 +348,49 @@
         <w:rPr>
           <w:color w:val="0000FF"/>
         </w:rPr>
-        <w:t>(mf&gt;p), then leave p&lt;f in the second half of the measure; for Bcl, add diminuendo to p from first quartermjote  to 2</w:t>
+        <w:t xml:space="preserve">(mf&gt;p), then leave p&lt;f in the second half of the measure; for </w:t>
+      </w:r>
+      <w:proofErr w:type="spellStart"/>
+      <w:r>
+        <w:rPr>
+          <w:color w:val="0000FF"/>
+        </w:rPr>
+        <w:t>Bcl</w:t>
+      </w:r>
+      <w:proofErr w:type="spellEnd"/>
+      <w:r>
+        <w:rPr>
+          <w:color w:val="0000FF"/>
+        </w:rPr>
+        <w:t xml:space="preserve">, add diminuendo </w:t>
+      </w:r>
+      <w:proofErr w:type="spellStart"/>
+      <w:r>
+        <w:rPr>
+          <w:color w:val="0000FF"/>
+        </w:rPr>
+        <w:t>to p</w:t>
+      </w:r>
+      <w:proofErr w:type="spellEnd"/>
+      <w:r>
+        <w:rPr>
+          <w:color w:val="0000FF"/>
+        </w:rPr>
+        <w:t xml:space="preserve"> from first </w:t>
+      </w:r>
+      <w:proofErr w:type="spellStart"/>
+      <w:r>
+        <w:rPr>
+          <w:color w:val="0000FF"/>
+        </w:rPr>
+        <w:t>quartermjote</w:t>
+      </w:r>
+      <w:proofErr w:type="spellEnd"/>
+      <w:r>
+        <w:rPr>
+          <w:color w:val="0000FF"/>
+        </w:rPr>
+        <w:t xml:space="preserve">  to 2</w:t>
       </w:r>
       <w:r>
         <w:rPr>
@@ -309,7 +403,21 @@
         <w:rPr>
           <w:color w:val="0000FF"/>
         </w:rPr>
-        <w:t xml:space="preserve"> then add (p) and cresc to mf on first beat of M18.</w:t>
+        <w:t xml:space="preserve"> then add (p) and </w:t>
+      </w:r>
+      <w:proofErr w:type="spellStart"/>
+      <w:r>
+        <w:rPr>
+          <w:color w:val="0000FF"/>
+        </w:rPr>
+        <w:t>cresc</w:t>
+      </w:r>
+      <w:proofErr w:type="spellEnd"/>
+      <w:r>
+        <w:rPr>
+          <w:color w:val="0000FF"/>
+        </w:rPr>
+        <w:t xml:space="preserve"> to mf on first beat of M18.</w:t>
       </w:r>
     </w:p>
     <w:p>
@@ -531,7 +639,35 @@
         <w:rPr>
           <w:color w:val="0000FF"/>
         </w:rPr>
-        <w:t>add “(mf) of beat 2 and diminuendo to ppp right before beat 4. Them replace M76 downbeat with “(ppp)”</w:t>
+        <w:t xml:space="preserve">add “(mf) of beat 2 and diminuendo to </w:t>
+      </w:r>
+      <w:proofErr w:type="spellStart"/>
+      <w:r>
+        <w:rPr>
+          <w:color w:val="0000FF"/>
+        </w:rPr>
+        <w:t>ppp</w:t>
+      </w:r>
+      <w:proofErr w:type="spellEnd"/>
+      <w:r>
+        <w:rPr>
+          <w:color w:val="0000FF"/>
+        </w:rPr>
+        <w:t xml:space="preserve"> right before beat 4. Them replace M76 downbeat with “(</w:t>
+      </w:r>
+      <w:proofErr w:type="spellStart"/>
+      <w:r>
+        <w:rPr>
+          <w:color w:val="0000FF"/>
+        </w:rPr>
+        <w:t>ppp</w:t>
+      </w:r>
+      <w:proofErr w:type="spellEnd"/>
+      <w:r>
+        <w:rPr>
+          <w:color w:val="0000FF"/>
+        </w:rPr>
+        <w:t>)”</w:t>
       </w:r>
     </w:p>
     <w:p>
@@ -557,7 +693,21 @@
         <w:rPr>
           <w:color w:val="0000FF"/>
         </w:rPr>
-        <w:t>M112, voice: add “(mf)” on beat 1 and diminuendo to ppp right before beat 4.</w:t>
+        <w:t xml:space="preserve">M112, voice: add “(mf)” on beat 1 and diminuendo to </w:t>
+      </w:r>
+      <w:proofErr w:type="spellStart"/>
+      <w:r>
+        <w:rPr>
+          <w:color w:val="0000FF"/>
+        </w:rPr>
+        <w:t>ppp</w:t>
+      </w:r>
+      <w:proofErr w:type="spellEnd"/>
+      <w:r>
+        <w:rPr>
+          <w:color w:val="0000FF"/>
+        </w:rPr>
+        <w:t xml:space="preserve"> right before beat 4.</w:t>
       </w:r>
       <w:r>
         <w:rPr>
@@ -667,7 +817,21 @@
         <w:rPr>
           <w:color w:val="0000FF"/>
         </w:rPr>
-        <w:t>M128, voice: add “mf &gt; ppp” from beat 2 to before beat 4</w:t>
+        <w:t xml:space="preserve">M128, voice: add “mf &gt; </w:t>
+      </w:r>
+      <w:proofErr w:type="spellStart"/>
+      <w:r>
+        <w:rPr>
+          <w:color w:val="0000FF"/>
+        </w:rPr>
+        <w:t>ppp</w:t>
+      </w:r>
+      <w:proofErr w:type="spellEnd"/>
+      <w:r>
+        <w:rPr>
+          <w:color w:val="0000FF"/>
+        </w:rPr>
+        <w:t>” from beat 2 to before beat 4</w:t>
       </w:r>
       <w:r>
         <w:rPr>
@@ -699,7 +863,21 @@
         <w:rPr>
           <w:color w:val="0000FF"/>
         </w:rPr>
-        <w:t>M130, voice: add “(mf) &gt; ppp” from beat 2 to end of bar</w:t>
+        <w:t xml:space="preserve">M130, voice: add “(mf) &gt; </w:t>
+      </w:r>
+      <w:proofErr w:type="spellStart"/>
+      <w:r>
+        <w:rPr>
+          <w:color w:val="0000FF"/>
+        </w:rPr>
+        <w:t>ppp</w:t>
+      </w:r>
+      <w:proofErr w:type="spellEnd"/>
+      <w:r>
+        <w:rPr>
+          <w:color w:val="0000FF"/>
+        </w:rPr>
+        <w:t>” from beat 2 to end of bar</w:t>
       </w:r>
     </w:p>
     <w:p>
@@ -1340,8 +1518,8 @@
   <w:abstractNum w:abstractNumId="5" w15:restartNumberingAfterBreak="0">
     <w:nsid w:val="6B95053E"/>
     <w:multiLevelType w:val="hybridMultilevel"/>
-    <w:tmpl w:val="86C4A59E"/>
-    <w:lvl w:ilvl="0" w:tplc="04090001">
+    <w:tmpl w:val="2A9A9F5E"/>
+    <w:lvl w:ilvl="0" w:tplc="40846D7A">
       <w:start w:val="1"/>
       <w:numFmt w:val="bullet"/>
       <w:lvlText w:val=""/>
@@ -1351,6 +1529,7 @@
       </w:pPr>
       <w:rPr>
         <w:rFonts w:ascii="Symbol" w:hAnsi="Symbol" w:hint="default"/>
+        <w:color w:val="auto"/>
       </w:rPr>
     </w:lvl>
     <w:lvl w:ilvl="1" w:tplc="04090003" w:tentative="1">

</xml_diff>

<commit_message>
V5: Engraved pages 11-19. Pg 20-21 only partial. To be reviewed.
</commit_message>
<xml_diff>
--- a/Manuscript and House Style/Manuscript/Bonecas Russas Edits.docx
+++ b/Manuscript and House Style/Manuscript/Bonecas Russas Edits.docx
@@ -302,120 +302,118 @@
           <w:numId w:val="2"/>
         </w:numPr>
         <w:rPr>
-          <w:color w:val="0000FF"/>
-        </w:rPr>
-      </w:pPr>
-      <w:r>
-        <w:rPr>
-          <w:color w:val="0000FF"/>
+          <w:color w:val="A6A6A6" w:themeColor="background1" w:themeShade="A6"/>
+        </w:rPr>
+      </w:pPr>
+      <w:r>
+        <w:rPr>
+          <w:color w:val="A6A6A6" w:themeColor="background1" w:themeShade="A6"/>
         </w:rPr>
         <w:t xml:space="preserve">M17, voice: add diminuendo </w:t>
       </w:r>
       <w:proofErr w:type="spellStart"/>
       <w:r>
         <w:rPr>
-          <w:color w:val="0000FF"/>
+          <w:color w:val="A6A6A6" w:themeColor="background1" w:themeShade="A6"/>
         </w:rPr>
         <w:t xml:space="preserve">to </w:t>
       </w:r>
       <w:r>
         <w:rPr>
-          <w:color w:val="0000FF"/>
+          <w:color w:val="A6A6A6" w:themeColor="background1" w:themeShade="A6"/>
         </w:rPr>
         <w:t>p</w:t>
       </w:r>
       <w:proofErr w:type="spellEnd"/>
       <w:r>
         <w:rPr>
-          <w:color w:val="0000FF"/>
+          <w:color w:val="A6A6A6" w:themeColor="background1" w:themeShade="A6"/>
         </w:rPr>
         <w:t xml:space="preserve"> from first to 2</w:t>
       </w:r>
       <w:r>
         <w:rPr>
-          <w:color w:val="0000FF"/>
+          <w:color w:val="A6A6A6" w:themeColor="background1" w:themeShade="A6"/>
           <w:vertAlign w:val="superscript"/>
         </w:rPr>
         <w:t>nd</w:t>
       </w:r>
       <w:r>
         <w:rPr>
-          <w:color w:val="0000FF"/>
+          <w:color w:val="A6A6A6" w:themeColor="background1" w:themeShade="A6"/>
         </w:rPr>
         <w:t xml:space="preserve"> note, </w:t>
       </w:r>
       <w:r>
         <w:rPr>
-          <w:color w:val="0000FF"/>
+          <w:color w:val="A6A6A6" w:themeColor="background1" w:themeShade="A6"/>
         </w:rPr>
         <w:t xml:space="preserve">(mf&gt;p), then leave p&lt;f in the second half of the measure; for </w:t>
       </w:r>
       <w:proofErr w:type="spellStart"/>
       <w:r>
         <w:rPr>
-          <w:color w:val="0000FF"/>
+          <w:color w:val="A6A6A6" w:themeColor="background1" w:themeShade="A6"/>
         </w:rPr>
         <w:t>Bcl</w:t>
       </w:r>
       <w:proofErr w:type="spellEnd"/>
       <w:r>
         <w:rPr>
-          <w:color w:val="0000FF"/>
+          <w:color w:val="A6A6A6" w:themeColor="background1" w:themeShade="A6"/>
         </w:rPr>
         <w:t xml:space="preserve">, add diminuendo </w:t>
       </w:r>
       <w:proofErr w:type="spellStart"/>
       <w:r>
         <w:rPr>
-          <w:color w:val="0000FF"/>
+          <w:color w:val="A6A6A6" w:themeColor="background1" w:themeShade="A6"/>
         </w:rPr>
         <w:t>to p</w:t>
       </w:r>
       <w:proofErr w:type="spellEnd"/>
       <w:r>
         <w:rPr>
-          <w:color w:val="0000FF"/>
+          <w:color w:val="A6A6A6" w:themeColor="background1" w:themeShade="A6"/>
         </w:rPr>
         <w:t xml:space="preserve"> from first </w:t>
       </w:r>
+      <w:r>
+        <w:rPr>
+          <w:color w:val="A6A6A6" w:themeColor="background1" w:themeShade="A6"/>
+        </w:rPr>
+        <w:t>quarter note</w:t>
+      </w:r>
+      <w:r>
+        <w:rPr>
+          <w:color w:val="A6A6A6" w:themeColor="background1" w:themeShade="A6"/>
+        </w:rPr>
+        <w:t xml:space="preserve">  to 2</w:t>
+      </w:r>
+      <w:r>
+        <w:rPr>
+          <w:color w:val="A6A6A6" w:themeColor="background1" w:themeShade="A6"/>
+          <w:vertAlign w:val="superscript"/>
+        </w:rPr>
+        <w:t>nd</w:t>
+      </w:r>
+      <w:r>
+        <w:rPr>
+          <w:color w:val="A6A6A6" w:themeColor="background1" w:themeShade="A6"/>
+        </w:rPr>
+        <w:t xml:space="preserve"> then add (p) and </w:t>
+      </w:r>
       <w:proofErr w:type="spellStart"/>
       <w:r>
         <w:rPr>
-          <w:color w:val="0000FF"/>
-        </w:rPr>
-        <w:t>quartermjote</w:t>
+          <w:color w:val="A6A6A6" w:themeColor="background1" w:themeShade="A6"/>
+        </w:rPr>
+        <w:t>cresc</w:t>
       </w:r>
       <w:proofErr w:type="spellEnd"/>
       <w:r>
         <w:rPr>
-          <w:color w:val="0000FF"/>
-        </w:rPr>
-        <w:t xml:space="preserve">  to 2</w:t>
-      </w:r>
-      <w:r>
-        <w:rPr>
-          <w:color w:val="0000FF"/>
-          <w:vertAlign w:val="superscript"/>
-        </w:rPr>
-        <w:t>nd</w:t>
-      </w:r>
-      <w:r>
-        <w:rPr>
-          <w:color w:val="0000FF"/>
-        </w:rPr>
-        <w:t xml:space="preserve"> then add (p) and </w:t>
-      </w:r>
-      <w:proofErr w:type="spellStart"/>
-      <w:r>
-        <w:rPr>
-          <w:color w:val="0000FF"/>
-        </w:rPr>
-        <w:t>cresc</w:t>
-      </w:r>
-      <w:proofErr w:type="spellEnd"/>
-      <w:r>
-        <w:rPr>
-          <w:color w:val="0000FF"/>
+          <w:color w:val="A6A6A6" w:themeColor="background1" w:themeShade="A6"/>
         </w:rPr>
         <w:t xml:space="preserve"> to mf on first beat of M18.</w:t>
       </w:r>
@@ -441,7 +439,7 @@
       </w:pPr>
       <w:r>
         <w:rPr>
-          <w:color w:val="0000FF"/>
+          <w:color w:val="A6A6A6" w:themeColor="background1" w:themeShade="A6"/>
         </w:rPr>
         <w:lastRenderedPageBreak/>
         <w:t>M20, voice: change the rhythm of text and actual rhythm according to picture below:</w:t>
@@ -522,14 +520,20 @@
           <w:numId w:val="2"/>
         </w:numPr>
         <w:rPr>
-          <w:color w:val="0000FF"/>
-        </w:rPr>
-      </w:pPr>
-      <w:r>
-        <w:rPr>
-          <w:color w:val="0000FF"/>
+          <w:color w:val="FF66FF"/>
+        </w:rPr>
+      </w:pPr>
+      <w:r>
+        <w:rPr>
+          <w:color w:val="FF66FF"/>
         </w:rPr>
         <w:t>M60, voice, beat 3: connect first and second G# with a tie</w:t>
+      </w:r>
+      <w:r>
+        <w:rPr>
+          <w:color w:val="FF66FF"/>
+        </w:rPr>
+        <w:t xml:space="preserve"> [Unsure what this meant.]</w:t>
       </w:r>
     </w:p>
     <w:p>

</xml_diff>

<commit_message>
V6: Some minor progress for pgs 20-23
</commit_message>
<xml_diff>
--- a/Manuscript and House Style/Manuscript/Bonecas Russas Edits.docx
+++ b/Manuscript and House Style/Manuscript/Bonecas Russas Edits.docx
@@ -552,12 +552,12 @@
           <w:numId w:val="2"/>
         </w:numPr>
         <w:rPr>
-          <w:color w:val="0000FF"/>
-        </w:rPr>
-      </w:pPr>
-      <w:r>
-        <w:rPr>
-          <w:color w:val="0000FF"/>
+          <w:color w:val="A6A6A6" w:themeColor="background1" w:themeShade="A6"/>
+        </w:rPr>
+      </w:pPr>
+      <w:r>
+        <w:rPr>
+          <w:color w:val="A6A6A6" w:themeColor="background1" w:themeShade="A6"/>
         </w:rPr>
         <w:t>M67, voice: add another quarter note F on beat 3 and a quarter rest on beat 4, then add “(mf) on beat 2 and diminuendo to pp right before beat 4.</w:t>
       </w:r>
@@ -578,12 +578,12 @@
           <w:numId w:val="2"/>
         </w:numPr>
         <w:rPr>
-          <w:color w:val="0000FF"/>
-        </w:rPr>
-      </w:pPr>
-      <w:r>
-        <w:rPr>
-          <w:color w:val="0000FF"/>
+          <w:color w:val="A6A6A6" w:themeColor="background1" w:themeShade="A6"/>
+        </w:rPr>
+      </w:pPr>
+      <w:r>
+        <w:rPr>
+          <w:color w:val="A6A6A6" w:themeColor="background1" w:themeShade="A6"/>
         </w:rPr>
         <w:t>M68, voice: add mf-f (shape freely)</w:t>
       </w:r>

</xml_diff>

<commit_message>
V8: Completed Part I. Review in progress
</commit_message>
<xml_diff>
--- a/Manuscript and House Style/Manuscript/Bonecas Russas Edits.docx
+++ b/Manuscript and House Style/Manuscript/Bonecas Russas Edits.docx
@@ -566,7 +566,7 @@
       <w:pPr>
         <w:pStyle w:val="ListParagraph"/>
         <w:rPr>
-          <w:color w:val="0000FF"/>
+          <w:color w:val="A6A6A6" w:themeColor="background1" w:themeShade="A6"/>
         </w:rPr>
       </w:pPr>
     </w:p>
@@ -592,7 +592,7 @@
       <w:pPr>
         <w:pStyle w:val="ListParagraph"/>
         <w:rPr>
-          <w:color w:val="0000FF"/>
+          <w:color w:val="A6A6A6" w:themeColor="background1" w:themeShade="A6"/>
         </w:rPr>
       </w:pPr>
     </w:p>
@@ -604,12 +604,12 @@
           <w:numId w:val="2"/>
         </w:numPr>
         <w:rPr>
-          <w:color w:val="0000FF"/>
-        </w:rPr>
-      </w:pPr>
-      <w:r>
-        <w:rPr>
-          <w:color w:val="0000FF"/>
+          <w:color w:val="A6A6A6" w:themeColor="background1" w:themeShade="A6"/>
+        </w:rPr>
+      </w:pPr>
+      <w:r>
+        <w:rPr>
+          <w:color w:val="A6A6A6" w:themeColor="background1" w:themeShade="A6"/>
         </w:rPr>
         <w:t>M73, voice: move text “i-“ to F attack on beat 3, and move slur to start from same note as new text placement</w:t>
       </w:r>
@@ -630,48 +630,20 @@
           <w:numId w:val="2"/>
         </w:numPr>
         <w:rPr>
-          <w:color w:val="0000FF"/>
-        </w:rPr>
-      </w:pPr>
-      <w:r>
-        <w:rPr>
-          <w:color w:val="0000FF"/>
+          <w:color w:val="A6A6A6" w:themeColor="background1" w:themeShade="A6"/>
+        </w:rPr>
+      </w:pPr>
+      <w:r>
+        <w:rPr>
+          <w:color w:val="A6A6A6" w:themeColor="background1" w:themeShade="A6"/>
         </w:rPr>
         <w:t xml:space="preserve">M75, voice: </w:t>
       </w:r>
       <w:r>
         <w:rPr>
-          <w:color w:val="0000FF"/>
-        </w:rPr>
-        <w:t xml:space="preserve">add “(mf) of beat 2 and diminuendo to </w:t>
-      </w:r>
-      <w:proofErr w:type="spellStart"/>
-      <w:r>
-        <w:rPr>
-          <w:color w:val="0000FF"/>
-        </w:rPr>
-        <w:t>ppp</w:t>
-      </w:r>
-      <w:proofErr w:type="spellEnd"/>
-      <w:r>
-        <w:rPr>
-          <w:color w:val="0000FF"/>
-        </w:rPr>
-        <w:t xml:space="preserve"> right before beat 4. Them replace M76 downbeat with “(</w:t>
-      </w:r>
-      <w:proofErr w:type="spellStart"/>
-      <w:r>
-        <w:rPr>
-          <w:color w:val="0000FF"/>
-        </w:rPr>
-        <w:t>ppp</w:t>
-      </w:r>
-      <w:proofErr w:type="spellEnd"/>
-      <w:r>
-        <w:rPr>
-          <w:color w:val="0000FF"/>
-        </w:rPr>
-        <w:t>)”</w:t>
+          <w:color w:val="A6A6A6" w:themeColor="background1" w:themeShade="A6"/>
+        </w:rPr>
+        <w:t>add “(mf) of beat 2 and diminuendo to ppp right before beat 4. Them replace M76 downbeat with “(ppp)”</w:t>
       </w:r>
     </w:p>
     <w:p>
@@ -697,21 +669,7 @@
         <w:rPr>
           <w:color w:val="0000FF"/>
         </w:rPr>
-        <w:t xml:space="preserve">M112, voice: add “(mf)” on beat 1 and diminuendo to </w:t>
-      </w:r>
-      <w:proofErr w:type="spellStart"/>
-      <w:r>
-        <w:rPr>
-          <w:color w:val="0000FF"/>
-        </w:rPr>
-        <w:t>ppp</w:t>
-      </w:r>
-      <w:proofErr w:type="spellEnd"/>
-      <w:r>
-        <w:rPr>
-          <w:color w:val="0000FF"/>
-        </w:rPr>
-        <w:t xml:space="preserve"> right before beat 4.</w:t>
+        <w:t>M112, voice: add “(mf)” on beat 1 and diminuendo to ppp right before beat 4.</w:t>
       </w:r>
       <w:r>
         <w:rPr>
@@ -821,21 +779,7 @@
         <w:rPr>
           <w:color w:val="0000FF"/>
         </w:rPr>
-        <w:t xml:space="preserve">M128, voice: add “mf &gt; </w:t>
-      </w:r>
-      <w:proofErr w:type="spellStart"/>
-      <w:r>
-        <w:rPr>
-          <w:color w:val="0000FF"/>
-        </w:rPr>
-        <w:t>ppp</w:t>
-      </w:r>
-      <w:proofErr w:type="spellEnd"/>
-      <w:r>
-        <w:rPr>
-          <w:color w:val="0000FF"/>
-        </w:rPr>
-        <w:t>” from beat 2 to before beat 4</w:t>
+        <w:t>M128, voice: add “mf &gt; ppp” from beat 2 to before beat 4</w:t>
       </w:r>
       <w:r>
         <w:rPr>
@@ -867,42 +811,8 @@
         <w:rPr>
           <w:color w:val="0000FF"/>
         </w:rPr>
-        <w:t xml:space="preserve">M130, voice: add “(mf) &gt; </w:t>
-      </w:r>
-      <w:proofErr w:type="spellStart"/>
-      <w:r>
-        <w:rPr>
-          <w:color w:val="0000FF"/>
-        </w:rPr>
-        <w:t>ppp</w:t>
-      </w:r>
-      <w:proofErr w:type="spellEnd"/>
-      <w:r>
-        <w:rPr>
-          <w:color w:val="0000FF"/>
-        </w:rPr>
-        <w:t>” from beat 2 to end of bar</w:t>
-      </w:r>
-    </w:p>
-    <w:p>
-      <w:pPr>
-        <w:pStyle w:val="ListParagraph"/>
-        <w:rPr>
-          <w:color w:val="0000FF"/>
-        </w:rPr>
-      </w:pPr>
-    </w:p>
-    <w:p>
-      <w:pPr>
-        <w:pStyle w:val="ListParagraph"/>
-        <w:numPr>
-          <w:ilvl w:val="0"/>
-          <w:numId w:val="2"/>
-        </w:numPr>
-        <w:rPr>
-          <w:color w:val="0000FF"/>
-        </w:rPr>
-      </w:pPr>
+        <w:t>M130, voice: add “(mf) &gt; ppp” from beat 2 to end of bar</w:t>
+      </w:r>
     </w:p>
     <w:sectPr>
       <w:pgSz w:w="12240" w:h="15840"/>

</xml_diff>